<commit_message>
pestañas, carrusel y paginacion
</commit_message>
<xml_diff>
--- a/new/new.docx
+++ b/new/new.docx
@@ -5,13 +5,89 @@
     <w:p/>
     <w:p>
       <w:r>
+        <w:t>{acordeon}</w:t>
+      </w:r>
+    </w:p>
+    <w:p>
+      <w:pPr>
+        <w:rPr>
+          <w:b/>
+          <w:bCs/>
+        </w:rPr>
+      </w:pPr>
+      <w:r>
+        <w:t>&gt;&gt;</w:t>
+      </w:r>
+      <w:r>
+        <w:t xml:space="preserve"> </w:t>
+      </w:r>
+      <w:r>
+        <w:rPr>
+          <w:b/>
+          <w:bCs/>
+        </w:rPr>
+        <w:t>Titulo 1 del acordeón</w:t>
+      </w:r>
+    </w:p>
+    <w:p>
+      <w:r>
+        <w:t>Contenido 1 del acordeón</w:t>
+      </w:r>
+    </w:p>
+    <w:p>
+      <w:pPr>
+        <w:rPr>
+          <w:b/>
+          <w:bCs/>
+          <w:u w:val="single"/>
+        </w:rPr>
+      </w:pPr>
+      <w:r>
+        <w:t>&gt;&gt;</w:t>
+      </w:r>
+      <w:r>
+        <w:t xml:space="preserve"> </w:t>
+      </w:r>
+      <w:r>
+        <w:rPr>
+          <w:b/>
+          <w:bCs/>
+        </w:rPr>
+        <w:t xml:space="preserve">Titulo </w:t>
+      </w:r>
+      <w:r>
+        <w:rPr>
+          <w:b/>
+          <w:bCs/>
+        </w:rPr>
+        <w:t>2</w:t>
+      </w:r>
+      <w:r>
+        <w:rPr>
+          <w:b/>
+          <w:bCs/>
+        </w:rPr>
+        <w:t xml:space="preserve"> del acordeón</w:t>
+      </w:r>
+    </w:p>
+    <w:p>
+      <w:r>
+        <w:t>Contenido 2 del acordeón</w:t>
+      </w:r>
+    </w:p>
+    <w:p>
+      <w:r>
+        <w:t>{fin}</w:t>
+      </w:r>
+    </w:p>
+    <w:p/>
+    <w:p>
+      <w:r>
         <w:t>{</w:t>
       </w:r>
-      <w:proofErr w:type="spellStart"/>
-      <w:r>
-        <w:t>acordeon</w:t>
-      </w:r>
-      <w:proofErr w:type="spellEnd"/>
+      <w:r>
+        <w:t>pestañas</w:t>
+      </w:r>
       <w:r>
         <w:t>}</w:t>
       </w:r>
@@ -34,12 +110,22 @@
           <w:b/>
           <w:bCs/>
         </w:rPr>
-        <w:t>Titulo 1 del acordeón</w:t>
-      </w:r>
-    </w:p>
-    <w:p>
-      <w:r>
-        <w:t>Contenido 1 del acordeón</w:t>
+        <w:t xml:space="preserve">Titulo 1 </w:t>
+      </w:r>
+      <w:r>
+        <w:rPr>
+          <w:b/>
+          <w:bCs/>
+        </w:rPr>
+        <w:t>pestañas</w:t>
+      </w:r>
+    </w:p>
+    <w:p>
+      <w:r>
+        <w:t xml:space="preserve">Contenido 1 </w:t>
+      </w:r>
+      <w:r>
+        <w:t>pestañas</w:t>
       </w:r>
     </w:p>
     <w:p>
@@ -75,27 +161,238 @@
           <w:b/>
           <w:bCs/>
         </w:rPr>
-        <w:t xml:space="preserve"> del acordeón</w:t>
-      </w:r>
-    </w:p>
-    <w:p>
-      <w:r>
-        <w:t>Contenido 2 del acordeón</w:t>
-      </w:r>
-    </w:p>
-    <w:p>
-      <w:r>
-        <w:t xml:space="preserve">{fin </w:t>
-      </w:r>
-      <w:proofErr w:type="spellStart"/>
-      <w:r>
-        <w:t>acordeon</w:t>
-      </w:r>
-      <w:proofErr w:type="spellEnd"/>
+        <w:t xml:space="preserve"> </w:t>
+      </w:r>
+      <w:r>
+        <w:rPr>
+          <w:b/>
+          <w:bCs/>
+        </w:rPr>
+        <w:t>pestañas</w:t>
+      </w:r>
+    </w:p>
+    <w:p>
+      <w:r>
+        <w:t xml:space="preserve">Contenido 2 </w:t>
+      </w:r>
+      <w:r>
+        <w:t>pestañas</w:t>
+      </w:r>
+    </w:p>
+    <w:p>
+      <w:r>
+        <w:t>{fin}</w:t>
+      </w:r>
+    </w:p>
+    <w:p/>
+    <w:p>
+      <w:r>
+        <w:t>{</w:t>
+      </w:r>
+      <w:r>
+        <w:t>paginacion</w:t>
+      </w:r>
       <w:r>
         <w:t>}</w:t>
       </w:r>
     </w:p>
+    <w:p>
+      <w:pPr>
+        <w:rPr>
+          <w:b/>
+          <w:bCs/>
+        </w:rPr>
+      </w:pPr>
+      <w:r>
+        <w:t>&gt;&gt;</w:t>
+      </w:r>
+      <w:r>
+        <w:t xml:space="preserve"> </w:t>
+      </w:r>
+      <w:r>
+        <w:rPr>
+          <w:b/>
+          <w:bCs/>
+        </w:rPr>
+        <w:t xml:space="preserve">Titulo 1 </w:t>
+      </w:r>
+      <w:r>
+        <w:rPr>
+          <w:b/>
+          <w:bCs/>
+        </w:rPr>
+        <w:t>paginación</w:t>
+      </w:r>
+    </w:p>
+    <w:p>
+      <w:r>
+        <w:t xml:space="preserve">Contenido 1 </w:t>
+      </w:r>
+      <w:r>
+        <w:t>paginación</w:t>
+      </w:r>
+    </w:p>
+    <w:p>
+      <w:pPr>
+        <w:rPr>
+          <w:b/>
+          <w:bCs/>
+          <w:u w:val="single"/>
+        </w:rPr>
+      </w:pPr>
+      <w:r>
+        <w:t>&gt;&gt;</w:t>
+      </w:r>
+      <w:r>
+        <w:t xml:space="preserve"> </w:t>
+      </w:r>
+      <w:r>
+        <w:rPr>
+          <w:b/>
+          <w:bCs/>
+        </w:rPr>
+        <w:t xml:space="preserve">Titulo </w:t>
+      </w:r>
+      <w:r>
+        <w:rPr>
+          <w:b/>
+          <w:bCs/>
+        </w:rPr>
+        <w:t>2</w:t>
+      </w:r>
+      <w:r>
+        <w:rPr>
+          <w:b/>
+          <w:bCs/>
+        </w:rPr>
+        <w:t xml:space="preserve"> </w:t>
+      </w:r>
+      <w:r>
+        <w:rPr>
+          <w:b/>
+          <w:bCs/>
+        </w:rPr>
+        <w:t>paginación</w:t>
+      </w:r>
+    </w:p>
+    <w:p>
+      <w:r>
+        <w:t xml:space="preserve">Contenido 2 </w:t>
+      </w:r>
+      <w:r>
+        <w:t>paginación</w:t>
+      </w:r>
+    </w:p>
+    <w:p>
+      <w:r>
+        <w:t>{fin}</w:t>
+      </w:r>
+    </w:p>
+    <w:p/>
+    <w:p>
+      <w:r>
+        <w:t>{</w:t>
+      </w:r>
+      <w:r>
+        <w:t>carrusel</w:t>
+      </w:r>
+      <w:r>
+        <w:t>}</w:t>
+      </w:r>
+    </w:p>
+    <w:p>
+      <w:pPr>
+        <w:rPr>
+          <w:b/>
+          <w:bCs/>
+        </w:rPr>
+      </w:pPr>
+      <w:r>
+        <w:t>&gt;&gt;</w:t>
+      </w:r>
+      <w:r>
+        <w:t xml:space="preserve"> </w:t>
+      </w:r>
+      <w:r>
+        <w:rPr>
+          <w:b/>
+          <w:bCs/>
+        </w:rPr>
+        <w:t xml:space="preserve">Titulo 1 </w:t>
+      </w:r>
+      <w:r>
+        <w:rPr>
+          <w:b/>
+          <w:bCs/>
+        </w:rPr>
+        <w:t>carrusel</w:t>
+      </w:r>
+    </w:p>
+    <w:p>
+      <w:r>
+        <w:t xml:space="preserve">Contenido 1 </w:t>
+      </w:r>
+      <w:r>
+        <w:t>carrusel</w:t>
+      </w:r>
+    </w:p>
+    <w:p>
+      <w:pPr>
+        <w:rPr>
+          <w:b/>
+          <w:bCs/>
+          <w:u w:val="single"/>
+        </w:rPr>
+      </w:pPr>
+      <w:r>
+        <w:t>&gt;&gt;</w:t>
+      </w:r>
+      <w:r>
+        <w:t xml:space="preserve"> </w:t>
+      </w:r>
+      <w:r>
+        <w:rPr>
+          <w:b/>
+          <w:bCs/>
+        </w:rPr>
+        <w:t xml:space="preserve">Titulo </w:t>
+      </w:r>
+      <w:r>
+        <w:rPr>
+          <w:b/>
+          <w:bCs/>
+        </w:rPr>
+        <w:t>2</w:t>
+      </w:r>
+      <w:r>
+        <w:rPr>
+          <w:b/>
+          <w:bCs/>
+        </w:rPr>
+        <w:t xml:space="preserve"> </w:t>
+      </w:r>
+      <w:r>
+        <w:rPr>
+          <w:b/>
+          <w:bCs/>
+        </w:rPr>
+        <w:t>carrusel</w:t>
+      </w:r>
+    </w:p>
+    <w:p>
+      <w:r>
+        <w:t xml:space="preserve">Contenido 2 </w:t>
+      </w:r>
+      <w:r>
+        <w:t>carrusel</w:t>
+      </w:r>
+    </w:p>
+    <w:p>
+      <w:r>
+        <w:t>{fin}</w:t>
+      </w:r>
+    </w:p>
+    <w:p/>
     <w:sectPr>
       <w:pgSz w:w="11906" w:h="16838"/>
       <w:pgMar w:top="1417" w:right="1701" w:bottom="1417" w:left="1701" w:header="708" w:footer="708" w:gutter="0"/>

</xml_diff>